<commit_message>
feat: Bump to v1.3.0 — control/generate assemble ops, UTF-8 console fix, manual update
- Add `type: control` assemble operation: inserts/modifies *CONTROL_TERMINATION,
  *CONTROL_TIMESTEP, *CONTROL_ENERGY, *CONTROL_HOURGLASS, *CONTROL_BULK_VISCOSITY
- Add `type: generate` (shape: box) as first assemble op when base_model is omitted,
  enabling single-YAML workflows from mesh generation to analysis setup
- Add `type: update` assemble op: updates node coords from dynain/k-file (unmatched kept)
- Add `type: database` assemble op: crash/drop/nve/all presets for *DATABASE_* output
- Add `generate box` standalone command
- Fix Windows console Korean/UTF-8 encoding via SetConsoleOutputCP(65001) at startup
- Bump version v1.2.0 → v1.3.0 in main.cpp, CMakeLists.txt, manual
- Add assemble sections 39.17–39.20 to manual (generate/update/control/database)
- Add examples/assemble/al_cu_explicit.yaml: Al-Cu 2-layer single-YAML crash example

Co-Authored-By: Claude Sonnet 4.6 <noreply@anthropic.com>
</commit_message>
<xml_diff>
--- a/docs/KooRemapper_Manual.docx
+++ b/docs/KooRemapper_Manual.docx
@@ -22,7 +22,7 @@
           <w:i/>
           <w:sz w:val="18"/>
         </w:rPr>
-        <w:t>버전 1.2.0</w:t>
+        <w:t>버전 1.3.0</w:t>
       </w:r>
       <w:r>
         <w:rPr>
@@ -27821,6 +27821,244 @@
     </w:p>
     <w:p>
       <w:pPr>
+        <w:pStyle w:val="Heading3"/>
+      </w:pPr>
+      <w:r>
+        <w:t>39.17 generate — 메시 인라인 생성</w:t>
+      </w:r>
+    </w:p>
+    <w:p>
+      <w:r>
+        <w:rPr>
+          <w:rFonts w:ascii="Consolas" w:hAnsi="Consolas"/>
+          <w:color w:val="202020"/>
+          <w:sz w:val="18"/>
+        </w:rPr>
+        <w:t>base_model</w:t>
+      </w:r>
+      <w:r>
+        <w:t xml:space="preserve"> 없이 assemble 시작 시 첫 번째 오퍼레이션으로 사용:</w:t>
+      </w:r>
+    </w:p>
+    <w:p>
+      <w:pPr>
+        <w:spacing w:before="80" w:after="80"/>
+        <w:shd w:fill="F5F5F5" w:val="clear"/>
+      </w:pPr>
+      <w:r>
+        <w:rPr>
+          <w:rFonts w:ascii="Consolas" w:hAnsi="Consolas"/>
+          <w:color w:val="202020"/>
+          <w:sz w:val="17"/>
+        </w:rPr>
+        <w:t># base_model 키 없음</w:t>
+        <w:br/>
+        <w:t>output: my_model</w:t>
+        <w:br/>
+        <w:br/>
+        <w:t>operations:</w:t>
+        <w:br/>
+        <w:t xml:space="preserve">  - type: generate</w:t>
+        <w:br/>
+        <w:t xml:space="preserve">    shape: box</w:t>
+        <w:br/>
+        <w:t xml:space="preserve">    lx: 100.0   # X 길이 [mm]</w:t>
+        <w:br/>
+        <w:t xml:space="preserve">    ly:  20.0   # Y 길이 [mm]</w:t>
+        <w:br/>
+        <w:t xml:space="preserve">    lz:  10.0   # Z 길이 [mm]</w:t>
+        <w:br/>
+        <w:t xml:space="preserve">    nx: 10      # X 방향 요소 수</w:t>
+        <w:br/>
+        <w:t xml:space="preserve">    ny:  4</w:t>
+        <w:br/>
+        <w:t xml:space="preserve">    nz:  2</w:t>
+        <w:br/>
+        <w:t xml:space="preserve">    rho: 7.85e-9</w:t>
+        <w:br/>
+        <w:t xml:space="preserve">    E: 210000.0</w:t>
+        <w:br/>
+        <w:t xml:space="preserve">    nu: 0.3</w:t>
+        <w:br/>
+        <w:t xml:space="preserve">    mid: 1</w:t>
+        <w:br/>
+        <w:t xml:space="preserve">    secid: 1</w:t>
+        <w:br/>
+        <w:t xml:space="preserve">    pid: 1</w:t>
+        <w:br/>
+        <w:t xml:space="preserve">    part_title: Steel Box</w:t>
+      </w:r>
+    </w:p>
+    <w:p>
+      <w:r>
+        <w:t xml:space="preserve">독립 명령으로도 사용 가능: </w:t>
+      </w:r>
+      <w:r>
+        <w:rPr>
+          <w:rFonts w:ascii="Consolas" w:hAnsi="Consolas"/>
+          <w:color w:val="202020"/>
+          <w:sz w:val="18"/>
+        </w:rPr>
+        <w:t>KooRemapper generate box config.yaml</w:t>
+      </w:r>
+    </w:p>
+    <w:p>
+      <w:pPr>
+        <w:pStyle w:val="Heading3"/>
+      </w:pPr>
+      <w:r>
+        <w:t>39.18 update — 노드 좌표 업데이트</w:t>
+      </w:r>
+    </w:p>
+    <w:p>
+      <w:r>
+        <w:t xml:space="preserve">dynain 또는 K 파일의 </w:t>
+      </w:r>
+      <w:r>
+        <w:rPr>
+          <w:rFonts w:ascii="Consolas" w:hAnsi="Consolas"/>
+          <w:color w:val="202020"/>
+          <w:sz w:val="18"/>
+        </w:rPr>
+        <w:t>*NODE</w:t>
+      </w:r>
+      <w:r>
+        <w:t xml:space="preserve"> 블록에서 일치하는 NID만 좌표 갱신 (미정의 노드 유지):</w:t>
+      </w:r>
+    </w:p>
+    <w:p>
+      <w:pPr>
+        <w:spacing w:before="80" w:after="80"/>
+        <w:shd w:fill="F5F5F5" w:val="clear"/>
+      </w:pPr>
+      <w:r>
+        <w:rPr>
+          <w:rFonts w:ascii="Consolas" w:hAnsi="Consolas"/>
+          <w:color w:val="202020"/>
+          <w:sz w:val="17"/>
+        </w:rPr>
+        <w:t>- type: update</w:t>
+        <w:br/>
+        <w:t xml:space="preserve">  dynain: results/dynain</w:t>
+      </w:r>
+    </w:p>
+    <w:p>
+      <w:r>
+        <w:t xml:space="preserve">→ 독립 명령으로도 사용: </w:t>
+      </w:r>
+      <w:r>
+        <w:rPr>
+          <w:rFonts w:ascii="Consolas" w:hAnsi="Consolas"/>
+          <w:color w:val="202020"/>
+          <w:sz w:val="18"/>
+        </w:rPr>
+        <w:t>KooRemapper update config.yaml</w:t>
+      </w:r>
+    </w:p>
+    <w:p>
+      <w:pPr>
+        <w:pStyle w:val="Heading3"/>
+      </w:pPr>
+      <w:r>
+        <w:t>39.19 control — 해석 제어 카드 삽입</w:t>
+      </w:r>
+    </w:p>
+    <w:p>
+      <w:r>
+        <w:rPr>
+          <w:rFonts w:ascii="Consolas" w:hAnsi="Consolas"/>
+          <w:color w:val="202020"/>
+          <w:sz w:val="18"/>
+        </w:rPr>
+        <w:t>*CONTROL_*</w:t>
+      </w:r>
+      <w:r>
+        <w:t xml:space="preserve"> 카드를 삽입하거나 기존 카드 필드를 수정:</w:t>
+      </w:r>
+    </w:p>
+    <w:p>
+      <w:pPr>
+        <w:spacing w:before="80" w:after="80"/>
+        <w:shd w:fill="F5F5F5" w:val="clear"/>
+      </w:pPr>
+      <w:r>
+        <w:rPr>
+          <w:rFonts w:ascii="Consolas" w:hAnsi="Consolas"/>
+          <w:color w:val="202020"/>
+          <w:sz w:val="17"/>
+        </w:rPr>
+        <w:t>- type: control</w:t>
+        <w:br/>
+        <w:t xml:space="preserve">  endtime: 0.001    # *CONTROL_TERMINATION endtim (초)</w:t>
+        <w:br/>
+        <w:t xml:space="preserve">  tssfac: 0.9       # *CONTROL_TIMESTEP tssfac</w:t>
+        <w:br/>
+        <w:t xml:space="preserve">  dt2ms: -1.0e-7    # *CONTROL_TIMESTEP dt2ms (mass scaling, 음수)</w:t>
+        <w:br/>
+        <w:t xml:space="preserve">  energy: true      # *CONTROL_ENERGY: hgen=2, rwen=2, slnten=1, rylen=1</w:t>
+        <w:br/>
+        <w:t xml:space="preserve">  ihq: 4            # *CONTROL_HOURGLASS: stiffness-based</w:t>
+        <w:br/>
+        <w:t xml:space="preserve">  qh: 0.05          # hourglass coefficient</w:t>
+        <w:br/>
+        <w:t xml:space="preserve">  q1: 1.5           # *CONTROL_BULK_VISCOSITY quadratic</w:t>
+        <w:br/>
+        <w:t xml:space="preserve">  q2: 0.06          # linear bulk viscosity</w:t>
+      </w:r>
+    </w:p>
+    <w:p>
+      <w:r>
+        <w:t>기존 카드가 있으면 해당 필드만 수정. 없으면 신규 삽입.</w:t>
+      </w:r>
+    </w:p>
+    <w:p>
+      <w:pPr>
+        <w:pStyle w:val="Heading3"/>
+      </w:pPr>
+      <w:r>
+        <w:t>39.20 database — 출력 제어 카드 삽입</w:t>
+      </w:r>
+    </w:p>
+    <w:p>
+      <w:r>
+        <w:rPr>
+          <w:rFonts w:ascii="Consolas" w:hAnsi="Consolas"/>
+          <w:color w:val="202020"/>
+          <w:sz w:val="18"/>
+        </w:rPr>
+        <w:t>*DATABASE_*</w:t>
+      </w:r>
+      <w:r>
+        <w:t xml:space="preserve"> 출력 키워드 일괄 삽입 (assemble 내):</w:t>
+      </w:r>
+    </w:p>
+    <w:p>
+      <w:pPr>
+        <w:spacing w:before="80" w:after="80"/>
+        <w:shd w:fill="F5F5F5" w:val="clear"/>
+      </w:pPr>
+      <w:r>
+        <w:rPr>
+          <w:rFonts w:ascii="Consolas" w:hAnsi="Consolas"/>
+          <w:color w:val="202020"/>
+          <w:sz w:val="17"/>
+        </w:rPr>
+        <w:t>- type: database</w:t>
+        <w:br/>
+        <w:t xml:space="preserve">  preset: crash     # crash / drop / nve / all</w:t>
+        <w:br/>
+        <w:t xml:space="preserve">  dt: 0.0001        # ASCII 출력 간격 (초)</w:t>
+        <w:br/>
+        <w:t xml:space="preserve">  dt_plot: 0.001    # d3plot 출력 간격</w:t>
+      </w:r>
+    </w:p>
+    <w:p>
+      <w:r>
+        <w:t>→ 독립 명령 [37. database](#37-database--database-출력-제어) 참조</w:t>
+      </w:r>
+    </w:p>
+    <w:p>
+      <w:pPr>
         <w:pStyle w:val="Heading2"/>
       </w:pPr>
       <w:r>
@@ -28175,7 +28413,7 @@
         <w:rPr>
           <w:i/>
         </w:rPr>
-        <w:t>KooRemapper v1.2.0 | 이 문서는 모든 구현 기능을 포함합니다.</w:t>
+        <w:t>KooRemapper v1.3.0 | 이 문서는 모든 구현 기능을 포함합니다.</w:t>
       </w:r>
     </w:p>
     <w:sectPr>

</xml_diff>